<commit_message>
JMIR re-alignment completed + JMIR submission package assembled
- withheld amendments adapted to JMIR's named sections: chronology
  block, data dictionary table, qualitative findings table, heading
  fixes, NASSS as numbered citation [47] with reference entry;
  tables positionally renumbered 1-10 (parity with JIKM)
- package: manuscript, JMIR cover letter, Multimedia Appendix 1,
  figures zip, checklist README (fallback rule restated), bundle zip
- publication copy re-frozen

Co-Authored-By: Claude Fable 5 <noreply@anthropic.com>
Claude-Session: https://claude.ai/code/session_01KoT3i8geZspYBMMKVYJUTG
</commit_message>
<xml_diff>
--- a/docs/papers/publication/Paper2_JMIR_SeriousGames_Publication_2026-09-10.docx
+++ b/docs/papers/publication/Paper2_JMIR_SeriousGames_Publication_2026-09-10.docx
@@ -193,7 +193,7 @@
         <w:jc w:val="both"/>
       </w:pPr>
       <w:r>
-        <w:t>At the level of whole technology programmes, nonadoption and abandonment are directly theorised by the NASSS framework (Greenhalgh et al., 2017), which locates their sources across the users, the technology, the organisation and the wider context of health and care deployments. NASSS therefore already accommodates the outcome observed here; what its domains do not specify is the psychological appraisal through which a single adverse experience becomes lasting non-return for a particular user. The FIDS-FIAS account is pitched at exactly that level: a candidate individual-level failure-appraisal mechanism, proposed to operate at the moment of an adverse assessment experience. It is offered as a complement to programme-level frameworks such as NASSS — a proposed refinement on the user side of such an analysis — not as a replacement for them, and its status remains hypothetical pending confirmatory testing.</w:t>
+        <w:t>At the level of whole technology programmes, nonadoption and abandonment are directly theorised by the NASSS framework [47], which locates their sources across the users, the technology, the organisation and the wider context of health and care deployments. NASSS therefore already accommodates the outcome observed here; what its domains do not specify is the psychological appraisal through which a single adverse experience becomes lasting non-return for a particular user. The FIDS-FIAS account is pitched at exactly that level: a candidate individual-level failure-appraisal mechanism, proposed to operate at the moment of an adverse assessment experience. It is offered as a complement to programme-level frameworks such as NASSS — a proposed refinement on the user side of such an analysis — not as a replacement for them, and its status remains hypothetical pending confirmatory testing.</w:t>
       </w:r>
     </w:p>
     <w:p>
@@ -297,7 +297,7 @@
     </w:p>
     <w:p>
       <w:r>
-        <w:t>No existing framework covers the full arc from initial adoption through failure to abandonment without documented return among older users of health technology. TAM explains initial adoption; Octalysis explains within-session engagement; self-efficacy theory explains initial dropout; Prospect Theory explains non-return; the attrition literature describes abandonment without a mechanism for this population; NASSS (Greenhalgh et al., 2017) maps nonadoption and abandonment across users, technology, organisation and context without specifying the individual-level appraisal at the moment of an adverse assessment experience; the fear-of-falling literature supplies instruments not yet applied to gamified FRA; and COM-B maps design choices without the underlying theory. This study addresses that gap.</w:t>
+        <w:t>No existing framework covers the full arc from initial adoption through failure to abandonment without documented return among older users of health technology. TAM explains initial adoption; Octalysis explains within-session engagement; self-efficacy theory explains initial dropout; Prospect Theory explains non-return; the attrition literature describes abandonment without a mechanism for this population; NASSS [47] maps nonadoption and abandonment across users, technology, organisation and context without specifying the individual-level appraisal at the moment of an adverse assessment experience; the fear-of-falling literature supplies instruments not yet applied to gamified FRA; and COM-B maps design choices without the underlying theory. This study addresses that gap.</w:t>
       </w:r>
     </w:p>
     <w:p>
@@ -371,6 +371,14 @@
     <w:p>
       <w:r>
         <w:t>Thirty elderly residents of the facility participated without remuneration: ages 62-84 (mean 71.1, SD 5.9), 13 men and 17 women, all with presenting fall-risk symptoms recorded in the study dataset. The facility extended the invitation to the 200 residents who had taken part in the Stage-1 survey; thirty joined, and the remaining 170 declined or did not take up the invitation - a self-selection boundary acknowledged in the Limitations. At the first attendance each participant completed a standard-mode FRA assessment before game play began; over the eight weeks participants then played the gamified FRA at the station in attended sessions. This was a single-group observational field study of dropout patterns, not a randomised controlled trial.</w:t>
+      </w:r>
+    </w:p>
+    <w:p>
+      <w:pPr>
+        <w:jc w:val="both"/>
+      </w:pPr>
+      <w:r>
+        <w:t>The deployment window and the subsequent analysis period are distinct phases of the study. The eight-week deployment was conducted between June and August 2025. The months that followed, extending into 2026, formed a data-processing period in which the study records were checked, the results analysed, and the therapists' observations - recorded contemporaneously during the deployment - interpreted. Apart from the post-deployment interviews with the nine sustained participants, conducted one to two days after the eight-week cycle, and the three centre-manager interviews (described under the qualitative record), this period consisted of record and analysis work only: it involved no participant follow-up and no further participant contact.</w:t>
       </w:r>
     </w:p>
     <w:p>
@@ -1002,6 +1010,265 @@
     </w:p>
     <w:p>
       <w:pPr>
+        <w:jc w:val="both"/>
+      </w:pPr>
+      <w:r>
+        <w:t>The table below provides a data dictionary for the archived variables, stating each measure's source and the clarifications that govern its reading.</w:t>
+      </w:r>
+    </w:p>
+    <w:p>
+      <w:pPr/>
+      <w:r>
+        <w:t>Table 2. Data dictionary for the archived study variables: source and clarifications.</w:t>
+      </w:r>
+    </w:p>
+    <w:tbl>
+      <w:tblPr>
+        <w:tblStyle w:val="TableGrid"/>
+        <w:tblW w:type="auto" w:w="0"/>
+        <w:tblLook w:firstColumn="1" w:firstRow="1" w:lastColumn="0" w:lastRow="0" w:noHBand="0" w:noVBand="1" w:val="04A0"/>
+      </w:tblPr>
+      <w:tblGrid>
+        <w:gridCol w:w="2880"/>
+        <w:gridCol w:w="2880"/>
+        <w:gridCol w:w="2880"/>
+      </w:tblGrid>
+      <w:tr>
+        <w:tc>
+          <w:tcPr>
+            <w:tcW w:type="dxa" w:w="2880"/>
+          </w:tcPr>
+          <w:p>
+            <w:r>
+              <w:rPr>
+                <w:b/>
+              </w:rPr>
+              <w:t>Variable</w:t>
+            </w:r>
+          </w:p>
+        </w:tc>
+        <w:tc>
+          <w:tcPr>
+            <w:tcW w:type="dxa" w:w="2880"/>
+          </w:tcPr>
+          <w:p>
+            <w:r>
+              <w:rPr>
+                <w:b/>
+              </w:rPr>
+              <w:t>Source</w:t>
+            </w:r>
+          </w:p>
+        </w:tc>
+        <w:tc>
+          <w:tcPr>
+            <w:tcW w:type="dxa" w:w="2880"/>
+          </w:tcPr>
+          <w:p>
+            <w:r>
+              <w:rPr>
+                <w:b/>
+              </w:rPr>
+              <w:t>Clarifications</w:t>
+            </w:r>
+          </w:p>
+        </w:tc>
+      </w:tr>
+      <w:tr>
+        <w:tc>
+          <w:tcPr>
+            <w:tcW w:type="dxa" w:w="2880"/>
+          </w:tcPr>
+          <w:p>
+            <w:r>
+              <w:t>Before-game index</w:t>
+            </w:r>
+          </w:p>
+        </w:tc>
+        <w:tc>
+          <w:tcPr>
+            <w:tcW w:type="dxa" w:w="2880"/>
+          </w:tcPr>
+          <w:p>
+            <w:r>
+              <w:t>InBody FRA composite index from a standard-mode FRA assessment at the participant's first attendance, before game play (the FRA used without the game link).</w:t>
+            </w:r>
+          </w:p>
+        </w:tc>
+        <w:tc>
+          <w:tcPr>
+            <w:tcW w:type="dxa" w:w="2880"/>
+          </w:tcPr>
+          <w:p>
+            <w:r>
+              <w:t>Higher values indicate better performance; the manufacturer calibrates the population average near 70 and reports positive correlations with the Berg Balance Scale and the Short Physical Performance Battery (InBody Co., Ltd., 2022).</w:t>
+            </w:r>
+          </w:p>
+        </w:tc>
+      </w:tr>
+      <w:tr>
+        <w:tc>
+          <w:tcPr>
+            <w:tcW w:type="dxa" w:w="2880"/>
+          </w:tcPr>
+          <w:p>
+            <w:r>
+              <w:t>After-game index</w:t>
+            </w:r>
+          </w:p>
+        </w:tc>
+        <w:tc>
+          <w:tcPr>
+            <w:tcW w:type="dxa" w:w="2880"/>
+          </w:tcPr>
+          <w:p>
+            <w:r>
+              <w:t>Game-generated index from the final attended gameplay episode; the dual-purpose input routes the same centre-of-pressure stream into the same measurement engine.</w:t>
+            </w:r>
+          </w:p>
+        </w:tc>
+        <w:tc>
+          <w:tcPr>
+            <w:tcW w:type="dxa" w:w="2880"/>
+          </w:tcPr>
+          <w:p>
+            <w:r>
+              <w:t>Recorded for all participants, including those with few completed runs; for one-run participants the before/after pair spans a single attendance, and post-measurement timing varies by participant.</w:t>
+            </w:r>
+          </w:p>
+        </w:tc>
+      </w:tr>
+      <w:tr>
+        <w:tc>
+          <w:tcPr>
+            <w:tcW w:type="dxa" w:w="2880"/>
+          </w:tcPr>
+          <w:p>
+            <w:r>
+              <w:t>Game cycles</w:t>
+            </w:r>
+          </w:p>
+        </w:tc>
+        <w:tc>
+          <w:tcPr>
+            <w:tcW w:type="dxa" w:w="2880"/>
+          </w:tcPr>
+          <w:p>
+            <w:r>
+              <w:t>System-recorded count of completed downhill runs; one cycle is one completed run under the five-attempt rule.</w:t>
+            </w:r>
+          </w:p>
+        </w:tc>
+        <w:tc>
+          <w:tcPr>
+            <w:tcW w:type="dxa" w:w="2880"/>
+          </w:tcPr>
+          <w:p>
+            <w:r>
+              <w:t>The archive records completed-run counts, not attended visits: runs are not equated with sessions or visits, and incomplete attempts are not separately recorded.</w:t>
+            </w:r>
+          </w:p>
+        </w:tc>
+      </w:tr>
+      <w:tr>
+        <w:tc>
+          <w:tcPr>
+            <w:tcW w:type="dxa" w:w="2880"/>
+          </w:tcPr>
+          <w:p>
+            <w:r>
+              <w:t>Symptom improvement</w:t>
+            </w:r>
+          </w:p>
+        </w:tc>
+        <w:tc>
+          <w:tcPr>
+            <w:tcW w:type="dxa" w:w="2880"/>
+          </w:tcPr>
+          <w:p>
+            <w:r>
+              <w:t>Therapist observation (workbook column), relayed to and compiled by the researcher.</w:t>
+            </w:r>
+          </w:p>
+        </w:tc>
+        <w:tc>
+          <w:tcPr>
+            <w:tcW w:type="dxa" w:w="2880"/>
+          </w:tcPr>
+          <w:p>
+            <w:r>
+              <w:t>Not a participant self-report measure; reconciliation with the after-game questionnaire remains outstanding.</w:t>
+            </w:r>
+          </w:p>
+        </w:tc>
+      </w:tr>
+      <w:tr>
+        <w:tc>
+          <w:tcPr>
+            <w:tcW w:type="dxa" w:w="2880"/>
+          </w:tcPr>
+          <w:p>
+            <w:r>
+              <w:t>Satisfaction</w:t>
+            </w:r>
+          </w:p>
+        </w:tc>
+        <w:tc>
+          <w:tcPr>
+            <w:tcW w:type="dxa" w:w="2880"/>
+          </w:tcPr>
+          <w:p>
+            <w:r>
+              <w:t>Five-point scale rating recorded per participant via the after-game paper questionnaire.</w:t>
+            </w:r>
+          </w:p>
+        </w:tc>
+        <w:tc>
+          <w:tcPr>
+            <w:tcW w:type="dxa" w:w="2880"/>
+          </w:tcPr>
+          <w:p>
+            <w:r>
+              <w:t>Recorded values include 'Very satisfied', 'Satisfied', 'No comments' and 'Dissatisfied'; the exact administered wording, response options and timing have not yet been reproduced. 'No comments' is not a neutral rating; binary contrasts use 'Satisfied'/'Very satisfied' versus all other recorded responses.</w:t>
+            </w:r>
+          </w:p>
+        </w:tc>
+      </w:tr>
+      <w:tr>
+        <w:tc>
+          <w:tcPr>
+            <w:tcW w:type="dxa" w:w="2880"/>
+          </w:tcPr>
+          <w:p>
+            <w:r>
+              <w:t>Verified flag</w:t>
+            </w:r>
+          </w:p>
+        </w:tc>
+        <w:tc>
+          <w:tcPr>
+            <w:tcW w:type="dxa" w:w="2880"/>
+          </w:tcPr>
+          <w:p>
+            <w:r>
+              <w:t>Therapist check of the recorded contents (including improvement and cycle counts) against their knowledge of the participant.</w:t>
+            </w:r>
+          </w:p>
+        </w:tc>
+        <w:tc>
+          <w:tcPr>
+            <w:tcW w:type="dxa" w:w="2880"/>
+          </w:tcPr>
+          <w:p>
+            <w:r>
+              <w:t>An accuracy check on the record, not a measure of self-efficacy or psychological confidence; one study record could not be verified.</w:t>
+            </w:r>
+          </w:p>
+        </w:tc>
+      </w:tr>
+    </w:tbl>
+    <w:p>
+      <w:pPr>
         <w:pStyle w:val="Heading3"/>
       </w:pPr>
       <w:r>
@@ -1032,7 +1299,7 @@
     <w:p>
       <w:pPr/>
       <w:r>
-        <w:t>Table 2. Sensitivity analysis of the principal statistics with and without the unverified record. The primary analysis retains all thirty records; eligibility follows record provenance, not the favourability of values.</w:t>
+        <w:t>Table 3. Sensitivity analysis of the principal statistics with and without the unverified record. The primary analysis retains all thirty records; eligibility follows record provenance, not the favourability of values.</w:t>
       </w:r>
     </w:p>
     <w:tbl>
@@ -1256,7 +1523,7 @@
           <w:i/>
           <w:sz w:val="18"/>
         </w:rPr>
-        <w:t>Table 3. Recorded FRA index changes, sustained participants (N = 9).</w:t>
+        <w:t>Table 4. Recorded FRA index changes, sustained participants (N = 9).</w:t>
       </w:r>
     </w:p>
     <w:tbl>
@@ -1470,7 +1737,7 @@
     </w:tbl>
     <w:p>
       <w:r>
-        <w:t>Table 3 reports the recorded index changes for the nine participants who sustained engagement (≥ 4 completed runs — an exploratory grouping, formalised retrospectively around the protocol's three-to-five-play lower bound); this subgroup is defined by subsequent participation rather than by prior assignment, so its favourable changes cannot be read apart from that selection. Across the full sample of thirty, the paired change was +4.0 points (95% CI 0.5-7.6; dz = 0.42, 95% CI 0.05-0.79). A within-deployment change of this size may include measurement variation, familiarisation and practice effects, and is read as a promising signal rather than a demonstrated clinical effect.</w:t>
+        <w:t>Table 4 reports the recorded index changes for the nine participants who sustained engagement (≥ 4 completed runs — an exploratory grouping, formalised retrospectively around the protocol's three-to-five-play lower bound); this subgroup is defined by subsequent participation rather than by prior assignment, so its favourable changes cannot be read apart from that selection. Across the full sample of thirty, the paired change was +4.0 points (95% CI 0.5-7.6; dz = 0.42, 95% CI 0.05-0.79). A within-deployment change of this size may include measurement variation, familiarisation and practice effects, and is read as a promising signal rather than a demonstrated clinical effect.</w:t>
       </w:r>
     </w:p>
     <w:p>
@@ -1479,7 +1746,7 @@
           <w:i/>
           <w:sz w:val="18"/>
         </w:rPr>
-        <w:t>Table 4. Recorded FRA index changes, low-engagement group (cycles ≤ 3, N = 21).</w:t>
+        <w:t>Table 5. Recorded FRA index changes, low-engagement group (cycles ≤ 3, N = 21).</w:t>
       </w:r>
     </w:p>
     <w:tbl>
@@ -1673,7 +1940,7 @@
         <w:pStyle w:val="Heading2"/>
       </w:pPr>
       <w:r>
-        <w:t>The Abandonment Pattern</w:t>
+        <w:t>The Engagement and Non-Return Pattern</w:t>
       </w:r>
     </w:p>
     <w:p>
@@ -1682,7 +1949,7 @@
           <w:i/>
           <w:sz w:val="18"/>
         </w:rPr>
-        <w:t>Table 5. Engagement pattern (N = 30).</w:t>
+        <w:t>Table 6. Engagement pattern (N = 30).</w:t>
       </w:r>
     </w:p>
     <w:tbl>
@@ -1840,7 +2107,7 @@
     </w:tbl>
     <w:p>
       <w:r>
-        <w:t>The cycle distribution was: eight participants completed one cycle, seven completed two, six reached three, one reached four, five reached five, and three reached six. Of the 21 low-engagement participants, none has a later recorded run within the eight-week window. This absence of documented return within the window distinguishes the pattern from typical usage attrition, in which some users return [7]. Eight participants (26.7%) have a single recorded completed run (Figure 3). No time-to-event model is reported: the archive preserves cycle counts, not timestamps. The evidential core of the pattern is carried by the three directly observed quantities in Table 5 and by the satisfaction association above. Figure 3 shows the participant flow.</w:t>
+        <w:t>The cycle distribution was: eight participants completed one cycle, seven completed two, six reached three, one reached four, five reached five, and three reached six. Of the 21 low-engagement participants, none has a later recorded run within the eight-week window. This absence of documented return within the window distinguishes the pattern from typical usage attrition, in which some users return [7]. Eight participants (26.7%) have a single recorded completed run (Figure 3). No time-to-event model is reported: the archive preserves cycle counts, not timestamps. The evidential core of the pattern is carried by the three directly observed quantities in Table 6 and by the satisfaction association above. Figure 3 shows the participant flow.</w:t>
       </w:r>
     </w:p>
     <w:p>
@@ -1907,7 +2174,7 @@
           <w:i/>
           <w:sz w:val="18"/>
         </w:rPr>
-        <w:t>Table 6. Coding scheme (abbreviated; 8 of 13 attributes).</w:t>
+        <w:t>Table 7. Coding scheme (abbreviated; 8 of 13 attributes).</w:t>
       </w:r>
     </w:p>
     <w:tbl>
@@ -2300,7 +2567,7 @@
           <w:i/>
           <w:sz w:val="18"/>
         </w:rPr>
-        <w:t>Table 7. Composite score distribution (descriptive).</w:t>
+        <w:t>Table 8. Composite score distribution (descriptive).</w:t>
       </w:r>
     </w:p>
     <w:tbl>
@@ -2712,7 +2979,7 @@
     </w:p>
     <w:p>
       <w:r>
-        <w:t>A nine-question semi-structured interview protocol was designed for F4-cluster participants, to probe within days of a participant's last recorded run whether the decision to stop was immediate or deliberate (Table 8); questions 3 and 4 address H2 and H3, question 7 addresses H4, and question 9 probes domain reframing. The protocol was not administered in Stage 2 — the F4 residents' negative reaction to the experience made a research interview inappropriate at the time — and no F4 interview data exist; it is specified for the confirmatory study. The Stage-2 qualitative record comprises the after-game paper questionnaire completed by all thirty participants (the source of the satisfaction data); post-deployment interviews with all nine sustained participants, conducted one to two days after the eight-week cycle in Mandarin or Cantonese via a paper interview questionnaire, with the researcher's notes as the primary record; and three interviews with centre managers capturing the operator perspective. Themes were developed by the researcher from the contemporaneous field notes, compiled through near-daily contact with the therapists over the eight weeks; reported speech from the field notes and interview records is paraphrase unless explicitly marked as verbatim, and observations that run against the proposed mechanism are retained rather than reconciled away (Table 8). Because the sustained-participant interviews sample only those who continued — a subgroup defined by the outcome itself — their content can inform an account of persistence; it cannot establish the internal reasons of the participants who discontinued, which remain undocumented in this deployment and are assigned to the confirmatory study's interview protocol.</w:t>
+        <w:t>A nine-question semi-structured interview protocol was designed for F4-cluster participants, to probe within days of a participant's last recorded run whether the decision to stop was immediate or deliberate (Table 9); questions 3 and 4 address H2 and H3, question 7 addresses H4, and question 9 probes domain reframing. The protocol was not administered in Stage 2 — the F4 residents' negative reaction to the experience made a research interview inappropriate at the time — and no F4 interview data exist; it is specified for the confirmatory study. The Stage-2 qualitative record comprises the after-game paper questionnaire completed by all thirty participants (the source of the satisfaction data); post-deployment interviews with all nine sustained participants, conducted one to two days after the eight-week cycle in Mandarin or Cantonese via a paper interview questionnaire, with the researcher's notes as the primary record; and three interviews with centre managers capturing the operator perspective. Themes were developed by the researcher from the contemporaneous field notes, compiled through near-daily contact with the therapists over the eight weeks; reported speech from the field notes and interview records is paraphrase unless explicitly marked as verbatim, and observations that run against the proposed mechanism are retained rather than reconciled away (Table 9). Because the sustained-participant interviews sample only those who continued — a subgroup defined by the outcome itself — their content can inform an account of persistence; it cannot establish the internal reasons of the participants who discontinued, which remain undocumented in this deployment and are assigned to the confirmatory study's interview protocol.</w:t>
       </w:r>
     </w:p>
     <w:p>
@@ -2721,7 +2988,7 @@
           <w:i/>
           <w:sz w:val="18"/>
         </w:rPr>
-        <w:t>Table 8. F4 interview protocol.</w:t>
+        <w:t>Table 9. F4 interview protocol.</w:t>
       </w:r>
     </w:p>
     <w:tbl>
@@ -3185,6 +3452,297 @@
     </w:p>
     <w:p>
       <w:pPr>
+        <w:jc w:val="both"/>
+      </w:pPr>
+      <w:r>
+        <w:t>The table below assembles the qualitative record systematically, pairing each documented finding with its supporting record and the alternative interpretations consistent with the evidence.</w:t>
+      </w:r>
+    </w:p>
+    <w:p>
+      <w:pPr/>
+      <w:r>
+        <w:t>Table 10. Qualitative findings, supporting records, and alternative interpretations.</w:t>
+      </w:r>
+    </w:p>
+    <w:tbl>
+      <w:tblPr>
+        <w:tblStyle w:val="TableGrid"/>
+        <w:tblW w:type="auto" w:w="0"/>
+        <w:tblLook w:firstColumn="1" w:firstRow="1" w:lastColumn="0" w:lastRow="0" w:noHBand="0" w:noVBand="1" w:val="04A0"/>
+      </w:tblPr>
+      <w:tblGrid>
+        <w:gridCol w:w="2880"/>
+        <w:gridCol w:w="2880"/>
+        <w:gridCol w:w="2880"/>
+      </w:tblGrid>
+      <w:tr>
+        <w:tc>
+          <w:tcPr>
+            <w:tcW w:type="dxa" w:w="2880"/>
+          </w:tcPr>
+          <w:p>
+            <w:r>
+              <w:rPr>
+                <w:b/>
+              </w:rPr>
+              <w:t>Finding</w:t>
+            </w:r>
+          </w:p>
+        </w:tc>
+        <w:tc>
+          <w:tcPr>
+            <w:tcW w:type="dxa" w:w="2880"/>
+          </w:tcPr>
+          <w:p>
+            <w:r>
+              <w:rPr>
+                <w:b/>
+              </w:rPr>
+              <w:t>Supporting record</w:t>
+            </w:r>
+          </w:p>
+        </w:tc>
+        <w:tc>
+          <w:tcPr>
+            <w:tcW w:type="dxa" w:w="2880"/>
+          </w:tcPr>
+          <w:p>
+            <w:r>
+              <w:rPr>
+                <w:b/>
+              </w:rPr>
+              <w:t>Alternative interpretation</w:t>
+            </w:r>
+          </w:p>
+        </w:tc>
+      </w:tr>
+      <w:tr>
+        <w:tc>
+          <w:tcPr>
+            <w:tcW w:type="dxa" w:w="2880"/>
+          </w:tcPr>
+          <w:p>
+            <w:r>
+              <w:t>Collapse sequence: players acknowledged the FRA’s benefits and recorded index gains, met recurring in-game failures across their second and third runs, and gave up despite the gains.</w:t>
+            </w:r>
+          </w:p>
+        </w:tc>
+        <w:tc>
+          <w:tcPr>
+            <w:tcW w:type="dxa" w:w="2880"/>
+          </w:tcPr>
+          <w:p>
+            <w:r>
+              <w:t>Contemporaneous researcher field notes, compiled from near-daily therapist reports during the eight-week window; a qualitative sequence with no per-participant counts.</w:t>
+            </w:r>
+          </w:p>
+        </w:tc>
+        <w:tc>
+          <w:tcPr>
+            <w:tcW w:type="dxa" w:w="2880"/>
+          </w:tcPr>
+          <w:p>
+            <w:r>
+              <w:t>Ordinary attrition (novelty wear-off) coinciding with the second and third runs; the ordering rests on the note-taker’s account, not on instrumented timing.</w:t>
+            </w:r>
+          </w:p>
+        </w:tc>
+      </w:tr>
+      <w:tr>
+        <w:tc>
+          <w:tcPr>
+            <w:tcW w:type="dxa" w:w="2880"/>
+          </w:tcPr>
+          <w:p>
+            <w:r>
+              <w:t>Visible-dropout social channel: remaining players saw the group thinning as dropouts accumulated, which contributed to further abandonment.</w:t>
+            </w:r>
+          </w:p>
+        </w:tc>
+        <w:tc>
+          <w:tcPr>
+            <w:tcW w:type="dxa" w:w="2880"/>
+          </w:tcPr>
+          <w:p>
+            <w:r>
+              <w:t>Same field-note record, retrieved from the archive during verification.</w:t>
+            </w:r>
+          </w:p>
+        </w:tc>
+        <w:tc>
+          <w:tcPr>
+            <w:tcW w:type="dxa" w:w="2880"/>
+          </w:tcPr>
+          <w:p>
+            <w:r>
+              <w:t>A collective, socially shared narrative about the station (Section XII); visible thinning may reflect, rather than cause, exit decisions already made.</w:t>
+            </w:r>
+          </w:p>
+        </w:tc>
+      </w:tr>
+      <w:tr>
+        <w:tc>
+          <w:tcPr>
+            <w:tcW w:type="dxa" w:w="2880"/>
+          </w:tcPr>
+          <w:p>
+            <w:r>
+              <w:t>Verdict-fear stance: ‘the game is fun… but I do not want it telling me where my health problems are’ — a paraphrase from the researcher’s notes, not a verbatim quotation.</w:t>
+            </w:r>
+          </w:p>
+        </w:tc>
+        <w:tc>
+          <w:tcPr>
+            <w:tcW w:type="dxa" w:w="2880"/>
+          </w:tcPr>
+          <w:p>
+            <w:r>
+              <w:t>Stage-2 interview record (researcher’s notes as the primary record).</w:t>
+            </w:r>
+          </w:p>
+        </w:tc>
+        <w:tc>
+          <w:tcPr>
+            <w:tcW w:type="dxa" w:w="2880"/>
+          </w:tcPr>
+          <w:p>
+            <w:r>
+              <w:t>The interview record reaches sustained participants and centre managers only; the stance shows the salience of the clinical frame but cannot establish the internal reasons of those who discontinued.</w:t>
+            </w:r>
+          </w:p>
+        </w:tc>
+      </w:tr>
+      <w:tr>
+        <w:tc>
+          <w:tcPr>
+            <w:tcW w:type="dxa" w:w="2880"/>
+          </w:tcPr>
+          <w:p>
+            <w:r>
+              <w:t>Satisfaction and observed symptom improvement tracked engagement: 9/9 sustained participants recorded satisfied or very satisfied, against 11/21 in the low-engagement group.</w:t>
+            </w:r>
+          </w:p>
+        </w:tc>
+        <w:tc>
+          <w:tcPr>
+            <w:tcW w:type="dxa" w:w="2880"/>
+          </w:tcPr>
+          <w:p>
+            <w:r>
+              <w:t>Symptom-improvement entries compiled by the researcher from therapists’ near-daily verbal reports (therapists kept no written per-participant records); satisfaction ratings from the after-game questionnaire.</w:t>
+            </w:r>
+          </w:p>
+        </w:tc>
+        <w:tc>
+          <w:tcPr>
+            <w:tcW w:type="dxa" w:w="2880"/>
+          </w:tcPr>
+          <w:p>
+            <w:r>
+              <w:t>Selection by outcome: the association may run in reverse, longer participation giving more opportunity for improvement and a positive rating; individual attribution of therapist observations was performed by the researcher at compilation.</w:t>
+            </w:r>
+          </w:p>
+        </w:tc>
+      </w:tr>
+      <w:tr>
+        <w:tc>
+          <w:tcPr>
+            <w:tcW w:type="dxa" w:w="2880"/>
+          </w:tcPr>
+          <w:p>
+            <w:r>
+              <w:t>Gains without return: most low-engagement participants left despite recorded index gains (group mean +2.8), and three F4-cluster members recorded an improved index in their single completed run yet did not return within the observation window.</w:t>
+            </w:r>
+          </w:p>
+        </w:tc>
+        <w:tc>
+          <w:tcPr>
+            <w:tcW w:type="dxa" w:w="2880"/>
+          </w:tcPr>
+          <w:p>
+            <w:r>
+              <w:t>Workbook index records paired with documented non-return within the observation window (no later recorded runs, corroborated by field observation).</w:t>
+            </w:r>
+          </w:p>
+        </w:tc>
+        <w:tc>
+          <w:tcPr>
+            <w:tcW w:type="dxa" w:w="2880"/>
+          </w:tcPr>
+          <w:p>
+            <w:r>
+              <w:t>Recorded gains of this size may reflect measurement variation or familiarisation; and because no clinical numbers were shown on the play screen, non-return need not have been decided in knowledge of the recorded gain.</w:t>
+            </w:r>
+          </w:p>
+        </w:tc>
+      </w:tr>
+      <w:tr>
+        <w:tc>
+          <w:tcPr>
+            <w:tcW w:type="dxa" w:w="2880"/>
+          </w:tcPr>
+          <w:p>
+            <w:r>
+              <w:t>Sustained-side puzzlement at non-participation: two of nine interviewees said they did not know why others would not try</w:t>
+            </w:r>
+          </w:p>
+        </w:tc>
+        <w:tc>
+          <w:tcPr>
+            <w:tcW w:type="dxa" w:w="2880"/>
+          </w:tcPr>
+          <w:p>
+            <w:r>
+              <w:t>Sustained-participant interview entry record (nine records; archived 10 September 2026)</w:t>
+            </w:r>
+          </w:p>
+        </w:tc>
+        <w:tc>
+          <w:tcPr>
+            <w:tcW w:type="dxa" w:w="2880"/>
+          </w:tcPr>
+          <w:p>
+            <w:r>
+              <w:t>Politeness or interviewer effect; a sustained-only view that cannot describe non-participants' reasons</w:t>
+            </w:r>
+          </w:p>
+        </w:tc>
+      </w:tr>
+      <w:tr>
+        <w:tc>
+          <w:tcPr>
+            <w:tcW w:type="dxa" w:w="2880"/>
+          </w:tcPr>
+          <w:p>
+            <w:r>
+              <w:t>Aesthetic criticism co-existing with satisfaction: four of nine criticised the visuals as weak or childish while rating enjoyment 4-5</w:t>
+            </w:r>
+          </w:p>
+        </w:tc>
+        <w:tc>
+          <w:tcPr>
+            <w:tcW w:type="dxa" w:w="2880"/>
+          </w:tcPr>
+          <w:p>
+            <w:r>
+              <w:t>Same interview entry record</w:t>
+            </w:r>
+          </w:p>
+        </w:tc>
+        <w:tc>
+          <w:tcPr>
+            <w:tcW w:type="dxa" w:w="2880"/>
+          </w:tcPr>
+          <w:p>
+            <w:r>
+              <w:t>Cohort-specific taste; consistent with the infantilisation risk raised in expert consultation, but not evidence of its behavioural effect</w:t>
+            </w:r>
+          </w:p>
+        </w:tc>
+      </w:tr>
+    </w:tbl>
+    <w:p>
+      <w:pPr>
         <w:pStyle w:val="Heading2"/>
       </w:pPr>
       <w:r>
@@ -3268,7 +3826,7 @@
         <w:pStyle w:val="Heading2"/>
       </w:pPr>
       <w:r>
-        <w:t>E. A Knowledge-Management Reading: Four Unresolved Links</w:t>
+        <w:t>A Knowledge-Management Reading: Four Unresolved Links</w:t>
       </w:r>
     </w:p>
     <w:p>
@@ -3284,7 +3842,7 @@
         <w:jc w:val="both"/>
       </w:pPr>
       <w:r>
-        <w:t>What the study adds to knowledge management is therefore a located problem rather than a resolved mechanism. In a system where knowledge generation is automatic, the least documented links were the interpretive and communicative ones between clinician and older user — and it is precisely at the moment of an adverse assessment experience, where the FIDS-FIAS account places its candidate mechanism, that those links would matter most. Recording each link explicitly — what is communicated, how it is received, and what follows — is added to the requirements of the confirmatory programme. This positioning also clarifies the relation to NASSS (Greenhalgh et al., 2017): NASSS supplies the programme-level map of nonadoption and abandonment across users, technology, organisation and context; FIDS-FIAS, if supported, would contribute one individual-level failure-appraisal mechanism within that map. The two operate at different levels and are complementary.</w:t>
+        <w:t>What the study adds to knowledge management is therefore a located problem rather than a resolved mechanism. In a system where knowledge generation is automatic, the least documented links were the interpretive and communicative ones between clinician and older user — and it is precisely at the moment of an adverse assessment experience, where the FIDS-FIAS account places its candidate mechanism, that those links would matter most. Recording each link explicitly — what is communicated, how it is received, and what follows — is added to the requirements of the confirmatory programme. This positioning also clarifies the relation to NASSS [47]: NASSS supplies the programme-level map of nonadoption and abandonment across users, technology, organisation and context; FIDS-FIAS, if supported, would contribute one individual-level failure-appraisal mechanism within that map. The two operate at different levels and are complementary.</w:t>
       </w:r>
     </w:p>
     <w:p>
@@ -3738,6 +4296,12 @@
         <w:t>[46] S. K. T. Tam and C. F. Cheung, "Investigating low utilisation of fall risk assessment among elderly users: A critical review through TAM and Octalysis frameworks with gamification approach," paper SS-293, in Proc. 10th Int. Conf. on Management Engineering, Software Engineering and Service Sciences (ICMSS 2026), Wuhan, China, Mar. 2026, Conference Publishing Services (CPS), in press (IEEE Xplore).</w:t>
       </w:r>
     </w:p>
+    <w:p>
+      <w:pPr/>
+      <w:r>
+        <w:t>[47] T. Greenhalgh, J. Wherton, C. Papoutsi, J. Lynch, G. Hughes, C. A'Court, S. Hinder, N. Fahy, R. Procter, and S. Shaw, 'Beyond adoption: A new framework for theorizing and evaluating nonadoption, abandonment, and challenges to the scale-up, spread, and sustainability of health and care technologies,' J. Med. Internet Res., vol. 19, no. 11, e367, 2017.</w:t>
+      </w:r>
+    </w:p>
     <w:sectPr>
       <w:pgSz w:w="12240" w:h="15840"/>
       <w:pgMar w:top="1440" w:right="1800" w:bottom="1440" w:left="1800" w:header="720" w:footer="720" w:gutter="0"/>

</xml_diff>